<commit_message>
Add impact-score robustness analysis (answers "why those weights?")
score_robustness.py re-weights the four impact axes across 2,000 random
weightings (each varied up to 3x in relative importance) and measures how much
the top-zone ranking moves:
- median Spearman 0.97 vs the shipped score; top-20 retains 18/20 on average
- arithmetic vs geometric mean still correlates 0.86
- no single axis dominates (drop-one Spearman > 0.82)

So the ranking reflects the data's structure, not a hand-tuned weighting.
Surfaced in the LaTeX/solution doc (new fig-robustness), the .pptx deck, and the
web methodology card; docs + changelog updated.

Co-Authored-By: Claude Opus 4.8 <noreply@anthropic.com>
Claude-Session: https://claude.ai/code/session_015xqbLKu3bgv91jhV9ZLyyM
</commit_message>
<xml_diff>
--- a/submission/ParkPulse_Solution.docx
+++ b/submission/ParkPulse_Solution.docx
@@ -790,6 +790,19 @@
     </w:p>
     <w:p>
       <w:pPr>
+        <w:pStyle w:val="Heading2"/>
+      </w:pPr>
+      <w:r>
+        <w:t>Is the score robust?</w:t>
+      </w:r>
+    </w:p>
+    <w:p>
+      <w:r>
+        <w:t>A fair question is whether the ranking is an artefact of the equal weighting. It is not. Across 2,000 random re-weightings of the four axes (each varied up to 3x in relative importance), the ranking holds at a median Spearman of 0.97 against the shipped score, and the top-20 zones retain 18 of 20 on average. Switching from a geometric to an arithmetic mean still correlates at 0.86, and no single axis dominates (dropping any one keeps Spearman above 0.82). The ranking reflects the data's structure, not a hand-tuned weighting.</w:t>
+      </w:r>
+    </w:p>
+    <w:p>
+      <w:pPr>
         <w:pStyle w:val="Heading1"/>
       </w:pPr>
       <w:r>

</xml_diff>

<commit_message>
Add turnkey OSM cross-check (independent validation of the impact score)
- enrich_osm.py: also computes k-sampled node betweenness centrality (road
  flow-criticality) alongside highway class + POIs.
- osm_validate.py: correlates the impact score (built WITHOUT the road network)
  against real OSM road criticality, betweenness, and nearby congestion-generators,
  and reports the top-N arterial/POI lift. Framed as an independent cross-check, not
  blended into the score, so agreement is the evidence and committed numbers are
  undisturbed. Validator verified on a synthetic hex_osm.csv; both scripts compile.
- Run locally (geo APIs blocked in CI): enrich_osm.py then osm_validate.py.
- Mentioned in the solution doc / LaTeX honesty section, run steps, and docs.

Co-Authored-By: Claude Opus 4.8 <noreply@anthropic.com>
Claude-Session: https://claude.ai/code/session_015xqbLKu3bgv91jhV9ZLyyM
</commit_message>
<xml_diff>
--- a/submission/ParkPulse_Solution.docx
+++ b/submission/ParkPulse_Solution.docx
@@ -1088,7 +1088,17 @@
         <w:t>No ground truth for impact.</w:t>
       </w:r>
       <w:r>
-        <w:t xml:space="preserve"> The score is an engineered index, not a measurement, and we never claim accuracy for it. We validate by face validity and stability.</w:t>
+        <w:t xml:space="preserve"> The score is an engineered index, not a measurement, and we never claim accuracy for it. We validate by face validity, month-to-month stability, and a robustness check on the weights. We also ship an independent OpenStreetMap cross-check (</w:t>
+      </w:r>
+      <w:r>
+        <w:rPr>
+          <w:rFonts w:ascii="Consolas" w:hAnsi="Consolas"/>
+          <w:color w:val="1B2A4A"/>
+        </w:rPr>
+        <w:t>scripts/osm_validate.py</w:t>
+      </w:r>
+      <w:r>
+        <w:t>): the score, built without the road network, is compared against real OSM road criticality and nearby congestion-generators, the closest thing to ground truth without a speed feed.</w:t>
       </w:r>
     </w:p>
     <w:p>

</xml_diff>